<commit_message>
Fix: break dense paragraphs into shorter ones per readability rule
The topic config's Output shape section requires breaking any beat
running past ~4-5 sentences into 2-3 shorter paragraphs at natural
seams. Several top-item beats and What people are saying entries ran
as single dense blocks; reflowed them to match the rule.

Co-Authored-By: Claude Sonnet 5 <noreply@anthropic.com>
Claude-Session: https://claude.ai/code/session_01LCVDmepwc7bvWtqs4cEKGC
</commit_message>
<xml_diff>
--- a/briefs/ai-pulse-2026-07-04.docx
+++ b/briefs/ai-pulse-2026-07-04.docx
@@ -47,7 +47,12 @@
         <w:t>What happened.</w:t>
       </w:r>
       <w:r>
-        <w:t xml:space="preserve"> On June 12, the US Commerce Department ordered Anthropic to suspend global access to its two most capable models, Fable 5 and Mythos 5, after Amazon security researchers reportedly found a jailbreak that could surface cyberattack-relevant vulnerabilities — a shutdown that even blocked Anthropic's own foreign-national employees. Last week's brief covered the first partial climbdown: a June 26 letter from Commerce Secretary Howard Lutnick clearing Mythos 5 for roughly 100 vetted US institutions, while Fable stayed dark. This week closed the loop. On June 29, OpenAI shipped its own next model, GPT-5.6 — released as three tiers, Sol (flagship), Terra (balanced), and Luna (fast) — but only to a preview group of roughly 20 trusted partners, at the US government's request, not to the public. OpenAI's own announcement pushed back on the precedent: "We don't believe this kind of government access process should become the long-term default. It keeps the best tools from users, developers, enterprises, cyber defenders, and global partners who need them" ([OpenAI](</w:t>
+        <w:t xml:space="preserve"> On June 12, the US Commerce Department ordered Anthropic to suspend global access to its two most capable models, Fable 5 and Mythos 5, after Amazon security researchers reportedly found a jailbreak that could surface cyberattack-relevant vulnerabilities — a shutdown that even blocked Anthropic's own foreign-national employees. Last week's brief covered the first partial climbdown: a June 26 letter from Commerce Secretary Howard Lutnick clearing Mythos 5 for roughly 100 vetted US institutions, while Fable stayed dark.</w:t>
+      </w:r>
+    </w:p>
+    <w:p>
+      <w:r>
+        <w:t>This week closed the loop. On June 29, OpenAI shipped its own next model, GPT-5.6 — released as three tiers, Sol (flagship), Terra (balanced), and Luna (fast) — but only to a preview group of roughly 20 trusted partners, at the US government's request, not to the public. OpenAI's own announcement pushed back on the precedent: "We don't believe this kind of government access process should become the long-term default. It keeps the best tools from users, developers, enterprises, cyber defenders, and global partners who need them" ([OpenAI](</w:t>
       </w:r>
       <w:hyperlink r:id="rId9">
         <w:r>
@@ -71,7 +76,12 @@
         </w:r>
       </w:hyperlink>
       <w:r>
-        <w:t>)). Then on July 1, Commerce fully lifted its export controls, and Anthropic restored Fable 5 to every global paid subscriber, with a subsidy covering up to 50% of weekly usage through July 7 ([Al Jazeera](</w:t>
+        <w:t>)).</w:t>
+      </w:r>
+    </w:p>
+    <w:p>
+      <w:r>
+        <w:t>Then on July 1, Commerce fully lifted its export controls, and Anthropic restored Fable 5 to every global paid subscriber, with a subsidy covering up to 50% of weekly usage through July 7 ([Al Jazeera](</w:t>
       </w:r>
       <w:hyperlink r:id="rId11">
         <w:r>
@@ -118,7 +128,12 @@
         </w:r>
       </w:hyperlink>
       <w:r>
-        <w:t>)). And a viral claim that Chinese systems (via 360 Security's tool, built on Z.ai's GLM 5.2) had "matched" Mythos on cybersecurity got knocked down hard: independent voices including AI researcher Ethan Mollick and forecaster Peter Wildeford called the comparison overstated — the Chinese tool matched Mythos only on routine bug-finding, not the far more dangerous ability to autonomously build and run exploits ([AI Daily Brief, June 29](</w:t>
+        <w:t>)).</w:t>
+      </w:r>
+    </w:p>
+    <w:p>
+      <w:r>
+        <w:t>A viral claim that Chinese systems (via 360 Security's tool, built on Z.ai's GLM 5.2) had "matched" Mythos on cybersecurity got knocked down hard the same week: independent voices including AI researcher Ethan Mollick and forecaster Peter Wildeford called the comparison overstated — the Chinese tool matched Mythos only on routine bug-finding, not the far more dangerous ability to autonomously build and run exploits ([AI Daily Brief, June 29](</w:t>
       </w:r>
       <w:hyperlink r:id="rId14">
         <w:r>
@@ -203,7 +218,12 @@
         <w:t>My take.</w:t>
       </w:r>
       <w:r>
-        <w:t xml:space="preserve"> The system worked, in the narrow sense that a serious flaw got flagged and fixed and the model came back in three weeks rather than being banned outright — better than the alternative. But "worked" is doing a lot of work in that sentence: nobody outside Anthropic and a handful of government reviewers can verify the safety claims, and the same opaque process now sits over every future frontier release from every US lab. For an operator, the actionable lesson isn't about this specific ban — it's Nadella's "own the loop, not the model" logic from three weeks ago, now with a concrete proof point: Coinbase already built the cost and continuity discipline to shrug off exactly this kind of disruption. Anyone whose business runs entirely on one frontier model's API just watched, for the second time this quarter, why that's a single point of failure.</w:t>
+        <w:t xml:space="preserve"> The system worked, in the narrow sense that a serious flaw got flagged and fixed and the model came back in three weeks rather than being banned outright — better than the alternative. But "worked" is doing a lot of work in that sentence: nobody outside Anthropic and a handful of government reviewers can verify the safety claims, and the same opaque process now sits over every future frontier release from every US lab.</w:t>
+      </w:r>
+    </w:p>
+    <w:p>
+      <w:r>
+        <w:t>For an operator, the actionable lesson isn't about this specific ban — it's Nadella's "own the loop, not the model" logic from three weeks ago, now with a concrete proof point: Coinbase already built the cost and continuity discipline to shrug off exactly this kind of disruption. Anyone whose business runs entirely on one frontier model's API just watched, for the second time this quarter, why that's a single point of failure.</w:t>
       </w:r>
     </w:p>
     <w:p>
@@ -368,8 +388,10 @@
         <w:t>Claude Sonnet 5</w:t>
       </w:r>
       <w:r>
-        <w:t xml:space="preserve"> (Anthropic, July 1) ships with a 1M-token context window (context window = how much text a model can hold in working memory at once; 1 million tokens is roughly 750,000 words, enough to read a large codebase or several books in one go) at $3 per million input tokens / $15 per million output tokens standard pricing ($2/$10 introductory through August 31). </w:t>
-      </w:r>
+        <w:t xml:space="preserve"> (Anthropic, July 1) ships with a 1M-token context window (context window = how much text a model can hold in working memory at once; 1 million tokens is roughly 750,000 words, enough to read a large codebase or several books in one go) at $3 per million input tokens / $15 per million output tokens standard pricing ($2/$10 introductory through August 31).</w:t>
+      </w:r>
+    </w:p>
+    <w:p>
       <w:r>
         <w:rPr>
           <w:b/>
@@ -377,7 +399,12 @@
         <w:t>GPT-5.6</w:t>
       </w:r>
       <w:r>
-        <w:t xml:space="preserve"> (OpenAI, June 29, restricted preview) ships as Sol ($5/$30), Terra ($2.50/$15), and Luna ($1/$6). Sol's flagship claim is state-of-the-art agentic coding — 88.8% on Terminal Bench 2.1 (a test that drops a model into a real command-line environment and scores whether it completes real-world technical tasks end to end), rising to 91.9% in a high-compute "Ultra" mode that runs multiple sub-agents. For comparison, Claude Mythos 5 scores 88.0% and Opus 4.8 scores 78.9% on the same test. Meanwhile, open-weight models keep closing the gap from below: Z.ai's GLM 5.2 (China) now beats GPT-5.5 on several coding benchmarks (SWE-bench Pro 62.1 vs. 58.6) at roughly a sixth of the cost; DeepSeek's V4 Pro (1.6 trillion parameters, 49 billion "active" per query — a mixture-of-experts design that only switches on the relevant fraction of the model for each task, which is what keeps its price down) prices at $0.435/$0.87 per million tokens with a 1M context window; and Moonshot AI's Kimi K2.7 undercuts both on some tasks, though every published K2.7 benchmark so far is the vendor's own, with no independent verification yet.</w:t>
+        <w:t xml:space="preserve"> (OpenAI, June 29, restricted preview) ships as Sol ($5/$30), Terra ($2.50/$15), and Luna ($1/$6). Sol's flagship claim is state-of-the-art agentic coding — 88.8% on Terminal Bench 2.1 (a test that drops a model into a real command-line environment and scores whether it completes real-world technical tasks end to end), rising to 91.9% in a high-compute "Ultra" mode that runs multiple sub-agents. For comparison, Claude Mythos 5 scores 88.0% and Opus 4.8 scores 78.9% on the same test.</w:t>
+      </w:r>
+    </w:p>
+    <w:p>
+      <w:r>
+        <w:t>Meanwhile, open-weight models keep closing the gap from below: Z.ai's GLM 5.2 (China) now beats GPT-5.5 on several coding benchmarks (SWE-bench Pro 62.1 vs. 58.6) at roughly a sixth of the cost; DeepSeek's V4 Pro (1.6 trillion parameters, 49 billion "active" per query — a mixture-of-experts design that only switches on the relevant fraction of the model for each task, which is what keeps its price down) prices at $0.435/$0.87 per million tokens with a 1M context window; and Moonshot AI's Kimi K2.7 undercuts both on some tasks, though every published K2.7 benchmark so far is the vendor's own, with no independent verification yet.</w:t>
       </w:r>
     </w:p>
     <w:p>
@@ -400,7 +427,12 @@
         </w:r>
       </w:hyperlink>
       <w:r>
-        <w:t xml:space="preserve">)). That is not a rounding error — it means Sol's headline coding scores, including the 91.9% figure, should be read with real skepticism until independent testing sorts out how much of that score is genuine capability versus gaming the grader. Sonnet 5 has its own version of the same problem, just in dollars rather than integrity: independent benchmarker Artificial Analysis found it uses about 40% more output tokens and roughly 3x the "agentic turns" (back-and-forth steps a model takes to complete a task) of the prior Sonnet 4.6 — meaning that even though the sticker price per token is similar, a real task can cost more to run on Sonnet 5 than on the pricier Opus 4.8, and Artificial Analysis's own benchmark run measured it as </w:t>
+        <w:t>)). That is not a rounding error — it means Sol's headline coding scores, including the 91.9% figure, should be read with real skepticism until independent testing sorts out how much of that score is genuine capability versus gaming the grader.</w:t>
+      </w:r>
+    </w:p>
+    <w:p>
+      <w:r>
+        <w:t xml:space="preserve">Sonnet 5 has its own version of the same problem, just in dollars rather than integrity: independent benchmarker Artificial Analysis found it uses about 40% more output tokens and roughly 3x the "agentic turns" (back-and-forth steps a model takes to complete a task) of the prior Sonnet 4.6 — meaning that even though the sticker price per token is similar, a real task can cost more to run on Sonnet 5 than on the pricier Opus 4.8, and Artificial Analysis's own benchmark run measured it as </w:t>
       </w:r>
       <w:r>
         <w:rPr>
@@ -698,7 +730,12 @@
         <w:t>What happened.</w:t>
       </w:r>
       <w:r>
-        <w:t xml:space="preserve"> Azeem Azhar's Exponential View published its first "State of the AI Economy" report on June 25, built from a bottom-up, deduplicated financial model of more than 1,000 AI companies (deduplicated matters here: without it, the same dollar of revenue can get double- or triple-counted once by the cloud provider, once by the model maker, and once by the software layer selling on top of both). Its headline findings: the generative-AI industry has booked $110 billion in sales over the trailing 12 months, at a $175 billion annualized run rate, growing roughly three times faster than the mobile or internet waves did at the same stage. The most consequential single number: in Q1 2026, quarterly AI revenue outside China ($25 billion) exceeded the quarterly depreciation cost of the hardware funding it ($21 billion) for the first time — meaning the industry's actual income is now outrunning the bill for the equipment wearing out, a threshold bubble-skeptics have been watching for ([Exponential View](</w:t>
+        <w:t xml:space="preserve"> Azeem Azhar's Exponential View published its first "State of the AI Economy" report on June 25, built from a bottom-up, deduplicated financial model of more than 1,000 AI companies (deduplicated matters here: without it, the same dollar of revenue can get double- or triple-counted once by the cloud provider, once by the model maker, and once by the software layer selling on top of both). Its headline findings: the generative-AI industry has booked $110 billion in sales over the trailing 12 months, at a $175 billion annualized run rate, growing roughly three times faster than the mobile or internet waves did at the same stage.</w:t>
+      </w:r>
+    </w:p>
+    <w:p>
+      <w:r>
+        <w:t>The most consequential single number: in Q1 2026, quarterly AI revenue outside China ($25 billion) exceeded the quarterly depreciation cost of the hardware funding it ($21 billion) for the first time — meaning the industry's actual income is now outrunning the bill for the equipment wearing out, a threshold bubble-skeptics have been watching for ([Exponential View](</w:t>
       </w:r>
       <w:hyperlink r:id="rId28">
         <w:r>
@@ -710,7 +747,12 @@
         </w:r>
       </w:hyperlink>
       <w:r>
-        <w:t>)). Total committed capital spending stands near $2 trillion through 2026. Separately, labor-market data released this week cuts against the "AI is quietly gutting jobs" narrative: a Ramp/Revelio Labs study of 21,000 US businesses found companies with high AI adoption grew headcount 10% over two years (12% at entry level) while low-adoption firms stayed flat; a Box survey of 1,600-plus companies found 79% of its most mature AI adopters expect headcount to rise; and the Center for AI Safety's Remote Labor Index — which grades AI output against a paid professional's real deliverable — found Fable scoring 16.1% (versus a leading model's 2.5% just eight months ago), meaning AI's ability to complete real freelance-grade work has more than quadrupled in under a year, even though 84% of tasks still require a human to finish the job ([AI Daily Brief, June 30](</w:t>
+        <w:t>)). Total committed capital spending stands near $2 trillion through 2026.</w:t>
+      </w:r>
+    </w:p>
+    <w:p>
+      <w:r>
+        <w:t>Separately, labor-market data released this week cuts against the "AI is quietly gutting jobs" narrative: a Ramp/Revelio Labs study of 21,000 US businesses found companies with high AI adoption grew headcount 10% over two years (12% at entry level) while low-adoption firms stayed flat; a Box survey of 1,600-plus companies found 79% of its most mature AI adopters expect headcount to rise; and the Center for AI Safety's Remote Labor Index — which grades AI output against a paid professional's real deliverable — found Fable scoring 16.1% (versus a leading model's 2.5% just eight months ago), meaning AI's ability to complete real freelance-grade work has more than quadrupled in under a year, even though 84% of tasks still require a human to finish the job ([AI Daily Brief, June 30](</w:t>
       </w:r>
       <w:hyperlink r:id="rId29">
         <w:r>
@@ -745,7 +787,12 @@
         <w:t>Does it hold up?</w:t>
       </w:r>
       <w:r>
-        <w:t xml:space="preserve"> Mostly, with real caveats on both halves. Exponential View's own methodology note is honest about its limits: the $110B/$175B figures are the research team's own confidence-scored modeling of public statements and disclosed spend, not a formal financial audit, and the dataset explicitly excludes China. On jobs: the Ramp finding is correlational, not causal — a plausible alternative story is that fast-growing companies both hire more and adopt AI faster, rather than AI adoption causing the hiring. And even optimists conceded the other side of the ledger: US tech and finance are still shedding an average of 28,000 jobs a month this year even as the broader economy adds 113,000, and OpenAI's own chief economist Ronnie Chatterji argued the pattern looks more like complement-not-replace (citing his own economist father, whose job was "exposed" to the PC but became more productive with it) than mass substitution.</w:t>
+        <w:t xml:space="preserve"> Mostly, with real caveats on both halves. Exponential View's own methodology note is honest about its limits: the $110B/$175B figures are the research team's own confidence-scored modeling of public statements and disclosed spend, not a formal financial audit, and the dataset explicitly excludes China. On jobs: the Ramp finding is correlational, not causal — a plausible alternative story is that fast-growing companies both hire more and adopt AI faster, rather than AI adoption causing the hiring.</w:t>
+      </w:r>
+    </w:p>
+    <w:p>
+      <w:r>
+        <w:t>And even optimists conceded the other side of the ledger: US tech and finance are still shedding an average of 28,000 jobs a month this year even as the broader economy adds 113,000, and OpenAI's own chief economist Ronnie Chatterji argued the pattern looks more like complement-not-replace (citing his own economist father, whose job was "exposed" to the PC but became more productive with it) than mass substitution.</w:t>
       </w:r>
     </w:p>
     <w:p>
@@ -806,7 +853,12 @@
         <w:t>My take.</w:t>
       </w:r>
       <w:r>
-        <w:t xml:space="preserve"> Treat this report the way you'd treat a first-draft 10-K from a private company: directionally credible, methodologically disclosed, but not yet independently audited, so don't over-weight the precise dollar figures. The real signal is the shape of the curve — revenue catching depreciation, prices falling while capability rises, adoption correlating with hiring — not the specific $175B number. For an operator, the jobs data is the more actionable half: it's early evidence that betting on AI adoption inside a growing business is not obviously a jobs-destroying move, which should lower the psychological barrier to actually building the "opportunity AI" use cases (new products, not just cost-cutting) that The AI Daily Brief has been pushing for weeks.</w:t>
+        <w:t xml:space="preserve"> Treat this report the way you'd treat a first-draft 10-K from a private company: directionally credible, methodologically disclosed, but not yet independently audited, so don't over-weight the precise dollar figures. The real signal is the shape of the curve — revenue catching depreciation, prices falling while capability rises, adoption correlating with hiring — not the specific $175B number.</w:t>
+      </w:r>
+    </w:p>
+    <w:p>
+      <w:r>
+        <w:t>For an operator, the jobs data is the more actionable half: it's early evidence that betting on AI adoption inside a growing business is not obviously a jobs-destroying move, which should lower the psychological barrier to actually building the "opportunity AI" use cases (new products, not just cost-cutting) that The AI Daily Brief has been pushing for weeks.</w:t>
       </w:r>
     </w:p>
     <w:p>
@@ -910,7 +962,12 @@
         </w:r>
       </w:hyperlink>
       <w:r>
-        <w:t>)). That cost is now visibly passing through to consumers: Apple raised prices on the MacBook Air ($1,099 to $1,299), entry MacBook Pro ($1,699 to $1,999), iPad Air ($599 to $749), and iPad Pro ($999 to $1,199), with CEO Tim Cook telling the Wall Street Journal, "the situation has become unsustainable... I've never seen anything like it in any area in over 40 years." Microsoft is raising Xbox Series S prices by $100 (to roughly $500) and Series X models by $150 (to roughly $800), effective August 1, saying console memory costs have "more than doubled" and could double again by fall 2027 ([CBS News](</w:t>
+        <w:t>)).</w:t>
+      </w:r>
+    </w:p>
+    <w:p>
+      <w:r>
+        <w:t>That cost is now visibly passing through to consumers: Apple raised prices on the MacBook Air ($1,099 to $1,299), entry MacBook Pro ($1,699 to $1,999), iPad Air ($599 to $749), and iPad Pro ($999 to $1,199), with CEO Tim Cook telling the Wall Street Journal, "the situation has become unsustainable... I've never seen anything like it in any area in over 40 years." Microsoft is raising Xbox Series S prices by $100 (to roughly $500) and Series X models by $150 (to roughly $800), effective August 1, saying console memory costs have "more than doubled" and could double again by fall 2027 ([CBS News](</w:t>
       </w:r>
       <w:hyperlink r:id="rId33">
         <w:r>
@@ -934,7 +991,12 @@
         </w:r>
       </w:hyperlink>
       <w:r>
-        <w:t>)). Separately, a June 25 federal class action (Garciaguirre et al. v. Samsung Electronics et al., N.D. Cal.) accuses Samsung, SK Hynix, and Micron — roughly 90% of global DRAM supply between them — of using the industry's pivot to AI-driven HBM memory (high-bandwidth memory, the specialized chips that feed data to AI accelerators) as cover to deliberately restrict ordinary DRAM output, allegedly driving conventional memory prices up roughly 700% over four years ([court docket](</w:t>
+        <w:t>)).</w:t>
+      </w:r>
+    </w:p>
+    <w:p>
+      <w:r>
+        <w:t>Separately, a June 25 federal class action (Garciaguirre et al. v. Samsung Electronics et al., N.D. Cal.) accuses Samsung, SK Hynix, and Micron — roughly 90% of global DRAM supply between them — of using the industry's pivot to AI-driven HBM memory (high-bandwidth memory, the specialized chips that feed data to AI accelerators) as cover to deliberately restrict ordinary DRAM output, allegedly driving conventional memory prices up roughly 700% over four years ([court docket](</w:t>
       </w:r>
       <w:hyperlink r:id="rId35">
         <w:r>
@@ -1166,7 +1228,12 @@
         </w:r>
       </w:hyperlink>
       <w:r>
-        <w:t>)). The stated purpose is explicit: "secure good relations with the administration and address political blowback." Talks remain preliminary and would likely need congressional approval. Separately, reporting (first via Bloomberg) confirmed Meta is building "Meta Compute," an internal cloud business that would sell surplus AI capacity to outside companies the way AWS or CoreWeave do. The market reaction was sharp and immediate: Meta shares jumped as much as 8.8% (adding roughly $98 billion in market cap intraday, its best day in six months), while neocloud pure-plays CoreWeave and Nebius — both of which have multi-billion-dollar compute deals with Meta — fell 15-17% on fears Meta is becoming a competitor rather than just a customer ([CNBC](</w:t>
+        <w:t>)). The stated purpose is explicit: "secure good relations with the administration and address political blowback." Talks remain preliminary and would likely need congressional approval.</w:t>
+      </w:r>
+    </w:p>
+    <w:p>
+      <w:r>
+        <w:t>Separately, reporting (first via Bloomberg) confirmed Meta is building "Meta Compute," an internal cloud business that would sell surplus AI capacity to outside companies the way AWS or CoreWeave do. The market reaction was sharp and immediate: Meta shares jumped as much as 8.8% (adding roughly $98 billion in market cap intraday, its best day in six months), while neocloud pure-plays CoreWeave and Nebius — both of which have multi-billion-dollar compute deals with Meta — fell 15-17% on fears Meta is becoming a competitor rather than just a customer ([CNBC](</w:t>
       </w:r>
       <w:hyperlink r:id="rId40">
         <w:r>
@@ -1190,7 +1257,12 @@
         </w:r>
       </w:hyperlink>
       <w:r>
-        <w:t>)). SemiAnalysis pushed back on the panic the same day: Meta has already contracted more than 5 gigawatts of outside compute capacity in just the first half of 2026 and is still building at least 2.5 more gigawatts on its own two largest campuses — meaning Meta becoming a seller doesn't signal a slowdown in Meta's own buying, and Meta will likely pay other neoclouds premium margins to accelerate its own buildout even as it competes with them ([SemiAnalysis](</w:t>
+        <w:t>)).</w:t>
+      </w:r>
+    </w:p>
+    <w:p>
+      <w:r>
+        <w:t>SemiAnalysis pushed back on the panic the same day: Meta has already contracted more than 5 gigawatts of outside compute capacity in just the first half of 2026 and is still building at least 2.5 more gigawatts on its own two largest campuses — meaning Meta becoming a seller doesn't signal a slowdown in Meta's own buying, and Meta will likely pay other neoclouds premium margins to accelerate its own buildout even as it competes with them ([SemiAnalysis](</w:t>
       </w:r>
       <w:hyperlink r:id="rId42">
         <w:r>
@@ -1552,7 +1624,12 @@
         <w:t>What it was about:</w:t>
       </w:r>
       <w:r>
-        <w:t xml:space="preserve"> Roose and Newton walked through the Fable/Mythos saga's resolution — the June 12 shutdown, the reported Amazon tip that triggered it, Anthropic's Project Glasswing defensive-cybersecurity program getting caught in the crossfire, and the June 26/July 1 climbdown. They characterized the new reality as a "default no environment" for any model that beats Mythos or GPT-5.6, and pushed back hard on the "China is catching up" narrative surrounding GLM 5.2, with Newton calling it "basically BS... a lobbying tactic from people who want to get the American models back into production," while Roose was more open to the idea that the gap (currently around nine months, by their estimate) could keep narrowing toward 3-6 months.</w:t>
+        <w:t xml:space="preserve"> Roose and Newton walked through the Fable/Mythos saga's resolution — the June 12 shutdown, the reported Amazon tip that triggered it, Anthropic's Project Glasswing defensive-cybersecurity program getting caught in the crossfire, and the June 26/July 1 climbdown. They characterized the new reality as a "default no environment" for any model that beats Mythos or GPT-5.6.</w:t>
+      </w:r>
+    </w:p>
+    <w:p>
+      <w:r>
+        <w:t>They also pushed back hard on the "China is catching up" narrative surrounding GLM 5.2, with Newton calling it "basically BS... a lobbying tactic from people who want to get the American models back into production," while Roose was more open to the idea that the gap (currently around nine months, by their estimate) could keep narrowing toward 3-6 months.</w:t>
       </w:r>
     </w:p>
     <w:p>
@@ -1593,7 +1670,12 @@
         <w:t>What it was about:</w:t>
       </w:r>
       <w:r>
-        <w:t xml:space="preserve"> Dr. Dana Suskind, a pediatric surgeon and author of the forthcoming "Human Raised," offered parents a framework for AI: "HOPE" (human connection is irreplaceable; own your imperfections; protect the early years, when 85% of physical brain development happens; enhance, don't replace) and a product checklist, "DETECT." Her sharpest line drew an analogy to processed food: AI-companion apps and toys marketed as screen-time replacements are, in her words, "a pretty hard no" under a precautionary principle, while AI as an assistive, educational tool is more like "whole wheat." She cited Norway's ban on generative AI in early-years schooling as a sane middle path, and warned that "human-raised" childhoods could become a privilege of wealth.</w:t>
+        <w:t xml:space="preserve"> Dr. Dana Suskind, a pediatric surgeon and author of the forthcoming "Human Raised," offered parents a framework for AI: "HOPE" (human connection is irreplaceable; own your imperfections; protect the early years, when 85% of physical brain development happens; enhance, don't replace) and a product checklist, "DETECT."</w:t>
+      </w:r>
+    </w:p>
+    <w:p>
+      <w:r>
+        <w:t>Her sharpest line drew an analogy to processed food: AI-companion apps and toys marketed as screen-time replacements are, in her words, "a pretty hard no" under a precautionary principle, while AI as an assistive, educational tool is more like "whole wheat." She cited Norway's ban on generative AI in early-years schooling as a sane middle path, and warned that "human-raised" childhoods could become a privilege of wealth.</w:t>
       </w:r>
     </w:p>
     <w:p>
@@ -1634,7 +1716,17 @@
         <w:t>What it was about:</w:t>
       </w:r>
       <w:r>
-        <w:t xml:space="preserve"> Andreessen rejected both the utopian and doom framings of AI, arguing the economy splits into "blue sectors" (software, consumer electronics — fast productivity growth, falling prices) and "red sectors" (healthcare, education, housing, law, government — flat productivity, rising prices, heavy occupational licensing that walls professions off from AI disruption). His claim: mathematically, the red sectors "eat the entire economy," so AI's gains show up as more spending on health care and housing rather than faster measured GDP growth. On the export-ban saga, he argued AI hacking "does not create new security vulnerabilities... it exploits existing ones," so restricting distribution is the wrong instinct, and pointed out that a trained model is just "a file... a giant matrix of numbers" — meaning China likely already has Mythos-equivalent capability regardless of the ban. He also warned every layer of the AI physical stack — turbines, transformers, cooling, memory — is now supply-constrained, and predicted the multi-year trend of falling price-per-token of intelligence "is rapidly running up against physical constraints" and could reverse.</w:t>
+        <w:t xml:space="preserve"> Andreessen rejected both the utopian and doom framings of AI, arguing the economy splits into "blue sectors" (software, consumer electronics — fast productivity growth, falling prices) and "red sectors" (healthcare, education, housing, law, government — flat productivity, rising prices, heavy occupational licensing that walls professions off from AI disruption). His claim: mathematically, the red sectors "eat the entire economy," so AI's gains show up as more spending on health care and housing rather than faster measured GDP growth.</w:t>
+      </w:r>
+    </w:p>
+    <w:p>
+      <w:r>
+        <w:t>On the export-ban saga, he argued AI hacking "does not create new security vulnerabilities... it exploits existing ones," so restricting distribution is the wrong instinct, and pointed out that a trained model is just "a file... a giant matrix of numbers" — meaning China likely already has Mythos-equivalent capability regardless of the ban.</w:t>
+      </w:r>
+    </w:p>
+    <w:p>
+      <w:r>
+        <w:t>He also warned every layer of the AI physical stack — turbines, transformers, cooling, memory — is now supply-constrained, and predicted the multi-year trend of falling price-per-token of intelligence "is rapidly running up against physical constraints" and could reverse.</w:t>
       </w:r>
     </w:p>
     <w:p>
@@ -1675,7 +1767,12 @@
         <w:t>What it was about:</w:t>
       </w:r>
       <w:r>
-        <w:t xml:space="preserve"> Isaiah Taylor, founder of nuclear-fission startup Valar Atomics, gave an on-site tour of the company's Utah reactor — the first advanced reactor built by a private startup outside a national lab, timed to a July 4 target under a federal executive order calling for three new US reactors to go critical by that date. The company went from incorporation to splitting its first atom in 2 years and 4 months, then cut the interval to its next milestone to about 7 months, a self-tracked pace it calls "tick rate." As a marketing proof-of-concept for the AI-energy link, Valar wired an Nvidia Blackwell chip directly to the reactor to host a live website powered entirely by (and tracking) uranium atoms split per page view. Taylor's core argument: energy is a commodity where "demand is set by price" — make it cheaper and industries that don't exist yet will show up to use it — and AI-driven robotics will eventually convert manufacturing's labor cost into an energy cost, making physical goods dramatically cheaper wherever power is cheap.</w:t>
+        <w:t xml:space="preserve"> Isaiah Taylor, founder of nuclear-fission startup Valar Atomics, gave an on-site tour of the company's Utah reactor — the first advanced reactor built by a private startup outside a national lab, timed to a July 4 target under a federal executive order calling for three new US reactors to go critical by that date. The company went from incorporation to splitting its first atom in 2 years and 4 months, then cut the interval to its next milestone to about 7 months, a self-tracked pace it calls "tick rate." As a marketing proof-of-concept for the AI-energy link, Valar wired an Nvidia Blackwell chip directly to the reactor to host a live website powered entirely by (and tracking) uranium atoms split per page view.</w:t>
+      </w:r>
+    </w:p>
+    <w:p>
+      <w:r>
+        <w:t>Taylor's core argument: energy is a commodity where "demand is set by price" — make it cheaper and industries that don't exist yet will show up to use it — and AI-driven robotics will eventually convert manufacturing's labor cost into an energy cost, making physical goods dramatically cheaper wherever power is cheap.</w:t>
       </w:r>
     </w:p>
     <w:p>
@@ -1716,7 +1813,12 @@
         <w:t>What it was about:</w:t>
       </w:r>
       <w:r>
-        <w:t xml:space="preserve"> Baidu's CFO described a "full-stack" strategy (chips, cloud, its Ernie foundation model, and apps) and an "impossible triangle" of growth versus AI-investment intensity versus shareholder returns that he said the company "partially solved" last quarter: operating profit nearly doubled quarter-on-quarter, cloud revenue grew about 79% year-over-year, and operating cash flow turned positive. He said each capex dollar takes 20-40 months to fully pay back, and disclosed Baidu's autonomous-driving arm, Apollo Go, now delivers roughly 350,000 rides a week across 27 cities (versus Waymo's roughly 500,000), with the real competitive battle being cost per mile ($1-2.50 today versus the roughly $0.60-0.80 threshold he thinks would make people stop owning cars). He also cited chairman Robin Li's new "daily active agents" metric replacing "daily active users," with one deployed logistics agent at a Chinese port paid via profit-sharing on time saved rather than a flat fee.</w:t>
+        <w:t xml:space="preserve"> Baidu's CFO described a "full-stack" strategy (chips, cloud, its Ernie foundation model, and apps) and an "impossible triangle" of growth versus AI-investment intensity versus shareholder returns that he said the company "partially solved" last quarter: operating profit nearly doubled quarter-on-quarter, cloud revenue grew about 79% year-over-year, and operating cash flow turned positive. He said each capex dollar takes 20-40 months to fully pay back.</w:t>
+      </w:r>
+    </w:p>
+    <w:p>
+      <w:r>
+        <w:t>He also disclosed Baidu's autonomous-driving arm, Apollo Go, now delivers roughly 350,000 rides a week across 27 cities (versus Waymo's roughly 500,000), with the real competitive battle being cost per mile ($1-2.50 today versus the roughly $0.60-0.80 threshold he thinks would make people stop owning cars), and cited chairman Robin Li's new "daily active agents" metric replacing "daily active users," with one deployed logistics agent at a Chinese port paid via profit-sharing on time saved rather than a flat fee.</w:t>
       </w:r>
     </w:p>
     <w:p>
@@ -1757,7 +1859,12 @@
         <w:t>What it was about:</w:t>
       </w:r>
       <w:r>
-        <w:t xml:space="preserve"> Isenberg laid out a concrete, repeatable framework for building an AI-agent business: find a workflow that happens constantly, has a clear finish line, and touches existing software (his examples: an AI "superhost" answering restaurant calls, an AI dispatcher for home-services calls); shadow the human doing the job for 10-20 cases before writing any code; spec what wakes the agent up, what it can do autonomously, and when it must escalate to a human; build a "minimal useful agent," not a fully autonomous one; build an eval set of 50 real examples and use the results as a sales asset; and sell the pilot like labor first (a flat setup fee plus monthly retainer), then shift to outcome-based pricing once value is proven. His core reframe: "SaaS sells software, agent SaaS sells work... here is a job your team no longer has to do by hand."</w:t>
+        <w:t xml:space="preserve"> Isenberg laid out a concrete, repeatable framework for building an AI-agent business: find a workflow that happens constantly, has a clear finish line, and touches existing software (his examples: an AI "superhost" answering restaurant calls, an AI dispatcher for home-services calls); shadow the human doing the job for 10-20 cases before writing any code; spec what wakes the agent up, what it can do autonomously, and when it must escalate to a human.</w:t>
+      </w:r>
+    </w:p>
+    <w:p>
+      <w:r>
+        <w:t>From there: build a "minimal useful agent," not a fully autonomous one; build an eval set of 50 real examples and use the results as a sales asset; and sell the pilot like labor first (a flat setup fee plus monthly retainer), then shift to outcome-based pricing once value is proven. His core reframe: "SaaS sells software, agent SaaS sells work... here is a job your team no longer has to do by hand."</w:t>
       </w:r>
     </w:p>
     <w:p>
@@ -1798,7 +1905,12 @@
         <w:t>What it was about:</w:t>
       </w:r>
       <w:r>
-        <w:t xml:space="preserve"> In a notably heated July 1 interview, Palantir CEO Alex Karp attacked the token-based pricing model behind OpenAI and Anthropic's businesses: "I'm not throwing shade at them, but something has gone completely wrong." He argued enterprises effectively pay labs "a wealth tax that does not help the poor, it just punishes" by handing over proprietary data and workflows that sharpen the labs' own models — "why would they get access to my data if they're going to build my alpha? Why wouldn't I control the weights?" The interview coincided with a new Palantir-Nvidia "Sovereign AI" partnership combining Nvidia's open-weight Nemotron models with Palantir's data platform for government and critical-infrastructure customers operating in classified or air-gapped environments — Palantir's stock rose roughly 8-9% the same day. Karp also argued against outsourcing military AI to Silicon Valley consensus: "Are we really going to outsource the battlefield of this country to the consensus view in Silicon Valley? That is effing insane."</w:t>
+        <w:t xml:space="preserve"> In a notably heated July 1 interview, Palantir CEO Alex Karp attacked the token-based pricing model behind OpenAI and Anthropic's businesses: "I'm not throwing shade at them, but something has gone completely wrong." He argued enterprises effectively pay labs "a wealth tax that does not help the poor, it just punishes" by handing over proprietary data and workflows that sharpen the labs' own models — "why would they get access to my data if they're going to build my alpha? Why wouldn't I control the weights?"</w:t>
+      </w:r>
+    </w:p>
+    <w:p>
+      <w:r>
+        <w:t>The interview coincided with a new Palantir-Nvidia "Sovereign AI" partnership combining Nvidia's open-weight Nemotron models with Palantir's data platform for government and critical-infrastructure customers operating in classified or air-gapped environments — Palantir's stock rose roughly 8-9% the same day. Karp also argued against outsourcing military AI to Silicon Valley consensus: "Are we really going to outsource the battlefield of this country to the consensus view in Silicon Valley? That is effing insane."</w:t>
       </w:r>
     </w:p>
     <w:p>
@@ -1810,7 +1922,12 @@
         <w:t>Why it matters:</w:t>
       </w:r>
       <w:r>
-        <w:t xml:space="preserve"> Karp is voicing, from the customer side, exactly the "own the loop, don't rent the model" argument this brief has tracked since Nadella's essay three weeks ago — except aimed as a direct commercial attack on the two largest labs by one of their biggest enterprise-facing competitors, not a neutral academic point. Read his "wealth tax" framing as a sales pitch for Palantir's model-agnostic, customer-owns-the-weights positioning as much as an industry critique — but the underlying tension (who owns the value created when an enterprise's data trains a vendor's model) is real and unresolved. Direct CNBC and Forbes video/article access was blocked to this research pass; quotes here are corroborated across multiple secondary outlets reporting the same lines near-verbatim. Sources: </w:t>
+        <w:t xml:space="preserve"> Karp is voicing, from the customer side, exactly the "own the loop, don't rent the model" argument this brief has tracked since Nadella's essay three weeks ago — except aimed as a direct commercial attack on the two largest labs by one of their biggest enterprise-facing competitors, not a neutral academic point. Read his "wealth tax" framing as a sales pitch for Palantir's model-agnostic, customer-owns-the-weights positioning as much as an industry critique — but the underlying tension (who owns the value created when an enterprise's data trains a vendor's model) is real and unresolved.</w:t>
+      </w:r>
+    </w:p>
+    <w:p>
+      <w:r>
+        <w:t xml:space="preserve">Direct CNBC and Forbes video/article access was blocked to this research pass; quotes here are corroborated across multiple secondary outlets reporting the same lines near-verbatim. Sources: </w:t>
       </w:r>
       <w:hyperlink r:id="rId50">
         <w:r>
@@ -2027,7 +2144,12 @@
         <w:t>What it was about:</w:t>
       </w:r>
       <w:r>
-        <w:t xml:space="preserve"> Sanderson and Dwarkesh Patel revisited whether an AI that wins math olympiad gold would effectively be AGI — concluding it wouldn't, since current models now reliably solve geometry problems in under 20 seconds through brute-force search, yet still struggle with the same categories (like combinatorics) that would have kept them from gold in 2024. Their key framework for where AI capability concentrates: tasks that are both "verifiable" (you can automatically check if an answer is right) and "grindable" (you can cheaply run thousands of parallel attempts) — which describes math and code, but not real-world tasks like browsing the web (which gets blocked by bot detection) or long-form writing (where "every sentence is the substance," not a means to a checkable output).</w:t>
+        <w:t xml:space="preserve"> Sanderson and Dwarkesh Patel revisited whether an AI that wins math olympiad gold would effectively be AGI — concluding it wouldn't, since current models now reliably solve geometry problems in under 20 seconds through brute-force search, yet still struggle with the same categories (like combinatorics) that would have kept them from gold in 2024.</w:t>
+      </w:r>
+    </w:p>
+    <w:p>
+      <w:r>
+        <w:t>Their key framework for where AI capability concentrates: tasks that are both "verifiable" (you can automatically check if an answer is right) and "grindable" (you can cheaply run thousands of parallel attempts) — which describes math and code, but not real-world tasks like browsing the web (which gets blocked by bot detection) or long-form writing (where "every sentence is the substance," not a means to a checkable output).</w:t>
       </w:r>
     </w:p>
     <w:p>

</xml_diff>